<commit_message>
Prepare HMon for Android and iOS store publishing via EAS
Add eas.json, store icons/splash, privacy policy draft, npm build/submit
scripts, and PUBLISHING.md with Play Store and App Store instructions.

Co-authored-by: Cursor <cursoragent@cursor.com>
</commit_message>
<xml_diff>
--- a/Hidroponia monitoring app specs.docx
+++ b/Hidroponia monitoring app specs.docx
@@ -3,12 +3,8 @@
 <w:document xmlns:wpc="http://schemas.microsoft.com/office/word/2010/wordprocessingCanvas" xmlns:cx="http://schemas.microsoft.com/office/drawing/2014/chartex" xmlns:cx1="http://schemas.microsoft.com/office/drawing/2015/9/8/chartex" xmlns:cx2="http://schemas.microsoft.com/office/drawing/2015/10/21/chartex" xmlns:cx3="http://schemas.microsoft.com/office/drawing/2016/5/9/chartex" xmlns:cx4="http://schemas.microsoft.com/office/drawing/2016/5/10/chartex" xmlns:cx5="http://schemas.microsoft.com/office/drawing/2016/5/11/chartex" xmlns:cx6="http://schemas.microsoft.com/office/drawing/2016/5/12/chartex" xmlns:cx7="http://schemas.microsoft.com/office/drawing/2016/5/13/chartex" xmlns:cx8="http://schemas.microsoft.com/office/drawing/2016/5/14/chartex" xmlns:mc="http://schemas.openxmlformats.org/markup-compatibility/2006" xmlns:aink="http://schemas.microsoft.com/office/drawing/2016/ink" xmlns:am3d="http://schemas.microsoft.com/office/drawing/2017/model3d" xmlns:o="urn:schemas-microsoft-com:office:office" xmlns:oel="http://schemas.microsoft.com/office/2019/extlst" xmlns:r="http://schemas.openxmlformats.org/officeDocument/2006/relationships" xmlns:m="http://schemas.openxmlformats.org/officeDocument/2006/math" xmlns:v="urn:schemas-microsoft-com:vml" xmlns:wp14="http://schemas.microsoft.com/office/word/2010/wordprocessingDrawing" xmlns:wp="http://schemas.openxmlformats.org/drawingml/2006/wordprocessingDrawing" xmlns:w10="urn:schemas-microsoft-com:office:word" xmlns:w="http://schemas.openxmlformats.org/wordprocessingml/2006/main" xmlns:w14="http://schemas.microsoft.com/office/word/2010/wordml" xmlns:w15="http://schemas.microsoft.com/office/word/2012/wordml" xmlns:w16cex="http://schemas.microsoft.com/office/word/2018/wordml/cex" xmlns:w16cid="http://schemas.microsoft.com/office/word/2016/wordml/cid" xmlns:w16="http://schemas.microsoft.com/office/word/2018/wordml" xmlns:w16du="http://schemas.microsoft.com/office/word/2023/wordml/word16du" xmlns:w16sdtdh="http://schemas.microsoft.com/office/word/2020/wordml/sdtdatahash" xmlns:w16sdtfl="http://schemas.microsoft.com/office/word/2024/wordml/sdtformatlock" xmlns:w16se="http://schemas.microsoft.com/office/word/2015/wordml/symex" xmlns:wpg="http://schemas.microsoft.com/office/word/2010/wordprocessingGroup" xmlns:wpi="http://schemas.microsoft.com/office/word/2010/wordprocessingInk" xmlns:wne="http://schemas.microsoft.com/office/word/2006/wordml" xmlns:wps="http://schemas.microsoft.com/office/word/2010/wordprocessingShape" mc:Ignorable="w14 w15 w16se w16cid w16 w16cex w16sdtdh w16sdtfl w16du wp14">
   <w:body>
     <w:p>
-      <w:r>
-        <w:t>Based on the provided HAI Project protocol document, here is a comprehensive software specifications list designed to support the required data collection, IoT integration, and AI-based analysis.</w:t>
-      </w:r>
-    </w:p>
-    <w:p>
-      <w:pPr>
+      <w:pPr>
+        <w:ind w:left="360"/>
         <w:rPr>
           <w:b/>
           <w:bCs/>
@@ -19,15 +15,12 @@
           <w:b/>
           <w:bCs/>
         </w:rPr>
-        <w:t>1. IoT Sensor Integration Module (Automated Data Collection)</w:t>
+        <w:t>IoT Sensor Integration Module (Automated Data Collection)</w:t>
       </w:r>
     </w:p>
     <w:p>
       <w:pPr>
-        <w:numPr>
-          <w:ilvl w:val="0"/>
-          <w:numId w:val="1"/>
-        </w:numPr>
+        <w:ind w:left="360"/>
       </w:pPr>
       <w:r>
         <w:t xml:space="preserve">The system must have an API or integration layer to automatically receive and record data from IoT sensors. </w:t>
@@ -35,10 +28,7 @@
     </w:p>
     <w:p>
       <w:pPr>
-        <w:numPr>
-          <w:ilvl w:val="0"/>
-          <w:numId w:val="1"/>
-        </w:numPr>
+        <w:ind w:left="360"/>
       </w:pPr>
       <w:r>
         <w:t xml:space="preserve">The database must store time-series data for the following parameters: pH, Electrical Conductivity (EC), Total Dissolved Solids (TDS), Water Temperature, Ambient Temperature, and Ambient Humidity. </w:t>
@@ -46,10 +36,7 @@
     </w:p>
     <w:p>
       <w:pPr>
-        <w:numPr>
-          <w:ilvl w:val="0"/>
-          <w:numId w:val="1"/>
-        </w:numPr>
+        <w:ind w:left="360"/>
       </w:pPr>
       <w:r>
         <w:t xml:space="preserve">The system must support </w:t>
@@ -65,6 +52,7 @@
     </w:p>
     <w:p>
       <w:pPr>
+        <w:ind w:left="360"/>
         <w:rPr>
           <w:b/>
           <w:bCs/>
@@ -75,15 +63,12 @@
           <w:b/>
           <w:bCs/>
         </w:rPr>
-        <w:t>2. Manual Data Entry Interface (Phenotyping &amp; Observations)</w:t>
+        <w:t>Manual Data Entry Interface (Phenotyping &amp; Observations)</w:t>
       </w:r>
     </w:p>
     <w:p>
       <w:pPr>
-        <w:numPr>
-          <w:ilvl w:val="0"/>
-          <w:numId w:val="2"/>
-        </w:numPr>
+        <w:ind w:left="360"/>
       </w:pPr>
       <w:r>
         <w:t xml:space="preserve">The software must provide digital forms for users to manually input plant phenotyping data, including Plant Height (cm), Stem Length (cm), Leaf Number (count), Leaf Area (cm²), and Shoot Number (count). </w:t>
@@ -91,10 +76,7 @@
     </w:p>
     <w:p>
       <w:pPr>
-        <w:numPr>
-          <w:ilvl w:val="0"/>
-          <w:numId w:val="2"/>
-        </w:numPr>
+        <w:ind w:left="360"/>
       </w:pPr>
       <w:r>
         <w:t xml:space="preserve">The data entry interface must map records to 10 distinct plants per hydroponic system, specifically labeled as P1 through P10. </w:t>
@@ -102,10 +84,7 @@
     </w:p>
     <w:p>
       <w:pPr>
-        <w:numPr>
-          <w:ilvl w:val="0"/>
-          <w:numId w:val="2"/>
-        </w:numPr>
+        <w:ind w:left="360"/>
       </w:pPr>
       <w:r>
         <w:t xml:space="preserve">The system should schedule and organize manual data entry tasks specifically for Mondays, Wednesdays, and Fridays, totaling 18 measurement points over a 6-week (42-day) experimental period. </w:t>
@@ -113,10 +92,7 @@
     </w:p>
     <w:p>
       <w:pPr>
-        <w:numPr>
-          <w:ilvl w:val="0"/>
-          <w:numId w:val="2"/>
-        </w:numPr>
+        <w:ind w:left="360"/>
       </w:pPr>
       <w:r>
         <w:t xml:space="preserve">A weekly logging form must be available (preferably scheduled for Mondays) to record lighting system data, including light type, daily light duration, light-plant distance, and zone light levels (left, center, right). </w:t>
@@ -124,10 +100,7 @@
     </w:p>
     <w:p>
       <w:pPr>
-        <w:numPr>
-          <w:ilvl w:val="0"/>
-          <w:numId w:val="2"/>
-        </w:numPr>
+        <w:ind w:left="360"/>
       </w:pPr>
       <w:r>
         <w:t xml:space="preserve">The lighting log must include a field to record observed plant issues, with categorical options: none, leaf burn, stretching, or yellowing. </w:t>
@@ -135,6 +108,7 @@
     </w:p>
     <w:p>
       <w:pPr>
+        <w:ind w:left="360"/>
         <w:rPr>
           <w:b/>
           <w:bCs/>
@@ -145,15 +119,12 @@
           <w:b/>
           <w:bCs/>
         </w:rPr>
-        <w:t>3. Image Management &amp; AI Processing Subsystem</w:t>
+        <w:t>Image Management &amp; AI Processing Subsystem</w:t>
       </w:r>
     </w:p>
     <w:p>
       <w:pPr>
-        <w:numPr>
-          <w:ilvl w:val="0"/>
-          <w:numId w:val="3"/>
-        </w:numPr>
+        <w:ind w:left="360"/>
       </w:pPr>
       <w:r>
         <w:t xml:space="preserve">The platform must allow users to upload standardized photographs every Monday. </w:t>
@@ -161,10 +132,7 @@
     </w:p>
     <w:p>
       <w:pPr>
-        <w:numPr>
-          <w:ilvl w:val="0"/>
-          <w:numId w:val="3"/>
-        </w:numPr>
+        <w:ind w:left="360"/>
       </w:pPr>
       <w:r>
         <w:t xml:space="preserve">The system must accommodate 11 total photographs per week per system: one overview image of the entire setup and 10 close-up images for individual plants (P1–P10). </w:t>
@@ -172,22 +140,15 @@
     </w:p>
     <w:p>
       <w:pPr>
-        <w:numPr>
-          <w:ilvl w:val="0"/>
-          <w:numId w:val="3"/>
-        </w:numPr>
-      </w:pPr>
-      <w:r>
-        <w:lastRenderedPageBreak/>
+        <w:ind w:left="360"/>
+      </w:pPr>
+      <w:r>
         <w:t xml:space="preserve">The software must include or integrate with the photo-based application currently under development at BAU to calculate the area of the largest leaf from the uploaded images. </w:t>
       </w:r>
     </w:p>
     <w:p>
       <w:pPr>
-        <w:numPr>
-          <w:ilvl w:val="0"/>
-          <w:numId w:val="3"/>
-        </w:numPr>
+        <w:ind w:left="360"/>
       </w:pPr>
       <w:r>
         <w:t xml:space="preserve">The image storage architecture must be structured and tagged appropriately to facilitate future AI-based image analysis. </w:t>
@@ -195,6 +156,7 @@
     </w:p>
     <w:p>
       <w:pPr>
+        <w:ind w:left="360"/>
         <w:rPr>
           <w:b/>
           <w:bCs/>
@@ -205,15 +167,13 @@
           <w:b/>
           <w:bCs/>
         </w:rPr>
-        <w:t>4. Analytics, AI, and Database Management</w:t>
+        <w:lastRenderedPageBreak/>
+        <w:t>Analytics, AI, and Database Management</w:t>
       </w:r>
     </w:p>
     <w:p>
       <w:pPr>
-        <w:numPr>
-          <w:ilvl w:val="0"/>
-          <w:numId w:val="4"/>
-        </w:numPr>
+        <w:ind w:left="360"/>
       </w:pPr>
       <w:r>
         <w:t xml:space="preserve">The database architecture must generate and export standardized datasets from the combined IoT and manual inputs to be used for AI-based analyses. </w:t>
@@ -221,10 +181,7 @@
     </w:p>
     <w:p>
       <w:pPr>
-        <w:numPr>
-          <w:ilvl w:val="0"/>
-          <w:numId w:val="4"/>
-        </w:numPr>
+        <w:ind w:left="360"/>
       </w:pPr>
       <w:r>
         <w:t xml:space="preserve">The platform must consolidate data into a common database to enable performance tracking and cross-country comparisons among participating schools. </w:t>
@@ -232,10 +189,7 @@
     </w:p>
     <w:p>
       <w:pPr>
-        <w:numPr>
-          <w:ilvl w:val="0"/>
-          <w:numId w:val="4"/>
-        </w:numPr>
+        <w:ind w:left="360"/>
       </w:pPr>
       <w:r>
         <w:t xml:space="preserve">The software must record metadata for each experiment, including the specific plant cultivar used (e.g., </w:t>
@@ -275,6 +229,119 @@
 <file path=word/numbering.xml><?xml version="1.0" encoding="utf-8"?>
 <w:numbering xmlns:wpc="http://schemas.microsoft.com/office/word/2010/wordprocessingCanvas" xmlns:cx="http://schemas.microsoft.com/office/drawing/2014/chartex" xmlns:cx1="http://schemas.microsoft.com/office/drawing/2015/9/8/chartex" xmlns:cx2="http://schemas.microsoft.com/office/drawing/2015/10/21/chartex" xmlns:cx3="http://schemas.microsoft.com/office/drawing/2016/5/9/chartex" xmlns:cx4="http://schemas.microsoft.com/office/drawing/2016/5/10/chartex" xmlns:cx5="http://schemas.microsoft.com/office/drawing/2016/5/11/chartex" xmlns:cx6="http://schemas.microsoft.com/office/drawing/2016/5/12/chartex" xmlns:cx7="http://schemas.microsoft.com/office/drawing/2016/5/13/chartex" xmlns:cx8="http://schemas.microsoft.com/office/drawing/2016/5/14/chartex" xmlns:mc="http://schemas.openxmlformats.org/markup-compatibility/2006" xmlns:aink="http://schemas.microsoft.com/office/drawing/2016/ink" xmlns:am3d="http://schemas.microsoft.com/office/drawing/2017/model3d" xmlns:o="urn:schemas-microsoft-com:office:office" xmlns:oel="http://schemas.microsoft.com/office/2019/extlst" xmlns:r="http://schemas.openxmlformats.org/officeDocument/2006/relationships" xmlns:m="http://schemas.openxmlformats.org/officeDocument/2006/math" xmlns:v="urn:schemas-microsoft-com:vml" xmlns:wp14="http://schemas.microsoft.com/office/word/2010/wordprocessingDrawing" xmlns:wp="http://schemas.openxmlformats.org/drawingml/2006/wordprocessingDrawing" xmlns:w10="urn:schemas-microsoft-com:office:word" xmlns:w="http://schemas.openxmlformats.org/wordprocessingml/2006/main" xmlns:w14="http://schemas.microsoft.com/office/word/2010/wordml" xmlns:w15="http://schemas.microsoft.com/office/word/2012/wordml" xmlns:w16cex="http://schemas.microsoft.com/office/word/2018/wordml/cex" xmlns:w16cid="http://schemas.microsoft.com/office/word/2016/wordml/cid" xmlns:w16="http://schemas.microsoft.com/office/word/2018/wordml" xmlns:w16du="http://schemas.microsoft.com/office/word/2023/wordml/word16du" xmlns:w16sdtdh="http://schemas.microsoft.com/office/word/2020/wordml/sdtdatahash" xmlns:w16sdtfl="http://schemas.microsoft.com/office/word/2024/wordml/sdtformatlock" xmlns:w16se="http://schemas.microsoft.com/office/word/2015/wordml/symex" xmlns:wpg="http://schemas.microsoft.com/office/word/2010/wordprocessingGroup" xmlns:wpi="http://schemas.microsoft.com/office/word/2010/wordprocessingInk" xmlns:wne="http://schemas.microsoft.com/office/word/2006/wordml" xmlns:wps="http://schemas.microsoft.com/office/word/2010/wordprocessingShape" mc:Ignorable="w14 w15 w16se w16cid w16 w16cex w16sdtdh w16sdtfl w16du wp14">
   <w:abstractNum w:abstractNumId="0" w15:restartNumberingAfterBreak="0">
+    <w:nsid w:val="387B0BB1"/>
+    <w:multiLevelType w:val="hybridMultilevel"/>
+    <w:tmpl w:val="6D5A6DC2"/>
+    <w:lvl w:ilvl="0" w:tplc="04090001">
+      <w:start w:val="1"/>
+      <w:numFmt w:val="bullet"/>
+      <w:lvlText w:val=""/>
+      <w:lvlJc w:val="left"/>
+      <w:pPr>
+        <w:ind w:left="720" w:hanging="360"/>
+      </w:pPr>
+      <w:rPr>
+        <w:rFonts w:ascii="Symbol" w:hAnsi="Symbol" w:hint="default"/>
+      </w:rPr>
+    </w:lvl>
+    <w:lvl w:ilvl="1" w:tplc="04090003" w:tentative="1">
+      <w:start w:val="1"/>
+      <w:numFmt w:val="bullet"/>
+      <w:lvlText w:val="o"/>
+      <w:lvlJc w:val="left"/>
+      <w:pPr>
+        <w:ind w:left="1440" w:hanging="360"/>
+      </w:pPr>
+      <w:rPr>
+        <w:rFonts w:ascii="Courier New" w:hAnsi="Courier New" w:cs="Courier New" w:hint="default"/>
+      </w:rPr>
+    </w:lvl>
+    <w:lvl w:ilvl="2" w:tplc="04090005" w:tentative="1">
+      <w:start w:val="1"/>
+      <w:numFmt w:val="bullet"/>
+      <w:lvlText w:val=""/>
+      <w:lvlJc w:val="left"/>
+      <w:pPr>
+        <w:ind w:left="2160" w:hanging="360"/>
+      </w:pPr>
+      <w:rPr>
+        <w:rFonts w:ascii="Wingdings" w:hAnsi="Wingdings" w:hint="default"/>
+      </w:rPr>
+    </w:lvl>
+    <w:lvl w:ilvl="3" w:tplc="04090001" w:tentative="1">
+      <w:start w:val="1"/>
+      <w:numFmt w:val="bullet"/>
+      <w:lvlText w:val=""/>
+      <w:lvlJc w:val="left"/>
+      <w:pPr>
+        <w:ind w:left="2880" w:hanging="360"/>
+      </w:pPr>
+      <w:rPr>
+        <w:rFonts w:ascii="Symbol" w:hAnsi="Symbol" w:hint="default"/>
+      </w:rPr>
+    </w:lvl>
+    <w:lvl w:ilvl="4" w:tplc="04090003" w:tentative="1">
+      <w:start w:val="1"/>
+      <w:numFmt w:val="bullet"/>
+      <w:lvlText w:val="o"/>
+      <w:lvlJc w:val="left"/>
+      <w:pPr>
+        <w:ind w:left="3600" w:hanging="360"/>
+      </w:pPr>
+      <w:rPr>
+        <w:rFonts w:ascii="Courier New" w:hAnsi="Courier New" w:cs="Courier New" w:hint="default"/>
+      </w:rPr>
+    </w:lvl>
+    <w:lvl w:ilvl="5" w:tplc="04090005" w:tentative="1">
+      <w:start w:val="1"/>
+      <w:numFmt w:val="bullet"/>
+      <w:lvlText w:val=""/>
+      <w:lvlJc w:val="left"/>
+      <w:pPr>
+        <w:ind w:left="4320" w:hanging="360"/>
+      </w:pPr>
+      <w:rPr>
+        <w:rFonts w:ascii="Wingdings" w:hAnsi="Wingdings" w:hint="default"/>
+      </w:rPr>
+    </w:lvl>
+    <w:lvl w:ilvl="6" w:tplc="04090001" w:tentative="1">
+      <w:start w:val="1"/>
+      <w:numFmt w:val="bullet"/>
+      <w:lvlText w:val=""/>
+      <w:lvlJc w:val="left"/>
+      <w:pPr>
+        <w:ind w:left="5040" w:hanging="360"/>
+      </w:pPr>
+      <w:rPr>
+        <w:rFonts w:ascii="Symbol" w:hAnsi="Symbol" w:hint="default"/>
+      </w:rPr>
+    </w:lvl>
+    <w:lvl w:ilvl="7" w:tplc="04090003" w:tentative="1">
+      <w:start w:val="1"/>
+      <w:numFmt w:val="bullet"/>
+      <w:lvlText w:val="o"/>
+      <w:lvlJc w:val="left"/>
+      <w:pPr>
+        <w:ind w:left="5760" w:hanging="360"/>
+      </w:pPr>
+      <w:rPr>
+        <w:rFonts w:ascii="Courier New" w:hAnsi="Courier New" w:cs="Courier New" w:hint="default"/>
+      </w:rPr>
+    </w:lvl>
+    <w:lvl w:ilvl="8" w:tplc="04090005" w:tentative="1">
+      <w:start w:val="1"/>
+      <w:numFmt w:val="bullet"/>
+      <w:lvlText w:val=""/>
+      <w:lvlJc w:val="left"/>
+      <w:pPr>
+        <w:ind w:left="6480" w:hanging="360"/>
+      </w:pPr>
+      <w:rPr>
+        <w:rFonts w:ascii="Wingdings" w:hAnsi="Wingdings" w:hint="default"/>
+      </w:rPr>
+    </w:lvl>
+  </w:abstractNum>
+  <w:abstractNum w:abstractNumId="1" w15:restartNumberingAfterBreak="0">
     <w:nsid w:val="433B67D6"/>
     <w:multiLevelType w:val="multilevel"/>
     <w:tmpl w:val="924CFC98"/>
@@ -423,7 +490,96 @@
       </w:rPr>
     </w:lvl>
   </w:abstractNum>
-  <w:abstractNum w:abstractNumId="1" w15:restartNumberingAfterBreak="0">
+  <w:abstractNum w:abstractNumId="2" w15:restartNumberingAfterBreak="0">
+    <w:nsid w:val="58550E19"/>
+    <w:multiLevelType w:val="hybridMultilevel"/>
+    <w:tmpl w:val="B0E6E764"/>
+    <w:lvl w:ilvl="0" w:tplc="0409000F">
+      <w:start w:val="1"/>
+      <w:numFmt w:val="decimal"/>
+      <w:lvlText w:val="%1."/>
+      <w:lvlJc w:val="left"/>
+      <w:pPr>
+        <w:ind w:left="720" w:hanging="360"/>
+      </w:pPr>
+      <w:rPr>
+        <w:rFonts w:hint="default"/>
+      </w:rPr>
+    </w:lvl>
+    <w:lvl w:ilvl="1" w:tplc="04090019" w:tentative="1">
+      <w:start w:val="1"/>
+      <w:numFmt w:val="lowerLetter"/>
+      <w:lvlText w:val="%2."/>
+      <w:lvlJc w:val="left"/>
+      <w:pPr>
+        <w:ind w:left="1440" w:hanging="360"/>
+      </w:pPr>
+    </w:lvl>
+    <w:lvl w:ilvl="2" w:tplc="0409001B" w:tentative="1">
+      <w:start w:val="1"/>
+      <w:numFmt w:val="lowerRoman"/>
+      <w:lvlText w:val="%3."/>
+      <w:lvlJc w:val="right"/>
+      <w:pPr>
+        <w:ind w:left="2160" w:hanging="180"/>
+      </w:pPr>
+    </w:lvl>
+    <w:lvl w:ilvl="3" w:tplc="0409000F" w:tentative="1">
+      <w:start w:val="1"/>
+      <w:numFmt w:val="decimal"/>
+      <w:lvlText w:val="%4."/>
+      <w:lvlJc w:val="left"/>
+      <w:pPr>
+        <w:ind w:left="2880" w:hanging="360"/>
+      </w:pPr>
+    </w:lvl>
+    <w:lvl w:ilvl="4" w:tplc="04090019" w:tentative="1">
+      <w:start w:val="1"/>
+      <w:numFmt w:val="lowerLetter"/>
+      <w:lvlText w:val="%5."/>
+      <w:lvlJc w:val="left"/>
+      <w:pPr>
+        <w:ind w:left="3600" w:hanging="360"/>
+      </w:pPr>
+    </w:lvl>
+    <w:lvl w:ilvl="5" w:tplc="0409001B" w:tentative="1">
+      <w:start w:val="1"/>
+      <w:numFmt w:val="lowerRoman"/>
+      <w:lvlText w:val="%6."/>
+      <w:lvlJc w:val="right"/>
+      <w:pPr>
+        <w:ind w:left="4320" w:hanging="180"/>
+      </w:pPr>
+    </w:lvl>
+    <w:lvl w:ilvl="6" w:tplc="0409000F" w:tentative="1">
+      <w:start w:val="1"/>
+      <w:numFmt w:val="decimal"/>
+      <w:lvlText w:val="%7."/>
+      <w:lvlJc w:val="left"/>
+      <w:pPr>
+        <w:ind w:left="5040" w:hanging="360"/>
+      </w:pPr>
+    </w:lvl>
+    <w:lvl w:ilvl="7" w:tplc="04090019" w:tentative="1">
+      <w:start w:val="1"/>
+      <w:numFmt w:val="lowerLetter"/>
+      <w:lvlText w:val="%8."/>
+      <w:lvlJc w:val="left"/>
+      <w:pPr>
+        <w:ind w:left="5760" w:hanging="360"/>
+      </w:pPr>
+    </w:lvl>
+    <w:lvl w:ilvl="8" w:tplc="0409001B" w:tentative="1">
+      <w:start w:val="1"/>
+      <w:numFmt w:val="lowerRoman"/>
+      <w:lvlText w:val="%9."/>
+      <w:lvlJc w:val="right"/>
+      <w:pPr>
+        <w:ind w:left="6480" w:hanging="180"/>
+      </w:pPr>
+    </w:lvl>
+  </w:abstractNum>
+  <w:abstractNum w:abstractNumId="3" w15:restartNumberingAfterBreak="0">
     <w:nsid w:val="6A9D4E4B"/>
     <w:multiLevelType w:val="multilevel"/>
     <w:tmpl w:val="A386E2A6"/>
@@ -572,7 +728,7 @@
       </w:rPr>
     </w:lvl>
   </w:abstractNum>
-  <w:abstractNum w:abstractNumId="2" w15:restartNumberingAfterBreak="0">
+  <w:abstractNum w:abstractNumId="4" w15:restartNumberingAfterBreak="0">
     <w:nsid w:val="6E4D4725"/>
     <w:multiLevelType w:val="multilevel"/>
     <w:tmpl w:val="12906B76"/>
@@ -721,7 +877,7 @@
       </w:rPr>
     </w:lvl>
   </w:abstractNum>
-  <w:abstractNum w:abstractNumId="3" w15:restartNumberingAfterBreak="0">
+  <w:abstractNum w:abstractNumId="5" w15:restartNumberingAfterBreak="0">
     <w:nsid w:val="7AE0390E"/>
     <w:multiLevelType w:val="multilevel"/>
     <w:tmpl w:val="162E4884"/>
@@ -871,16 +1027,22 @@
     </w:lvl>
   </w:abstractNum>
   <w:num w:numId="1" w16cid:durableId="277554">
-    <w:abstractNumId w:val="2"/>
+    <w:abstractNumId w:val="4"/>
   </w:num>
   <w:num w:numId="2" w16cid:durableId="762261055">
+    <w:abstractNumId w:val="5"/>
+  </w:num>
+  <w:num w:numId="3" w16cid:durableId="1610891332">
     <w:abstractNumId w:val="3"/>
   </w:num>
-  <w:num w:numId="3" w16cid:durableId="1610891332">
+  <w:num w:numId="4" w16cid:durableId="1819572580">
     <w:abstractNumId w:val="1"/>
   </w:num>
-  <w:num w:numId="4" w16cid:durableId="1819572580">
+  <w:num w:numId="5" w16cid:durableId="1531797221">
     <w:abstractNumId w:val="0"/>
+  </w:num>
+  <w:num w:numId="6" w16cid:durableId="1361587825">
+    <w:abstractNumId w:val="2"/>
   </w:num>
 </w:numbering>
 </file>
@@ -1488,6 +1650,7 @@
   <w:style w:type="character" w:default="1" w:styleId="DefaultParagraphFont">
     <w:name w:val="Default Paragraph Font"/>
     <w:uiPriority w:val="1"/>
+    <w:semiHidden/>
     <w:unhideWhenUsed/>
   </w:style>
   <w:style w:type="table" w:default="1" w:styleId="TableNormal">

</xml_diff>